<commit_message>
Add LinkedIn profile and regenerate assessment submission documents
</commit_message>
<xml_diff>
--- a/Git_GitHub_Practical_Assessment_Charan_Kurupudi_23MH1A05I2.docx
+++ b/Git_GitHub_Practical_Assessment_Charan_Kurupudi_23MH1A05I2.docx
@@ -83,7 +83,7 @@
                 <w:rFonts w:ascii="Arial" w:hAnsi="Arial"/>
                 <w:b/>
                 <w:color w:val="1A365D"/>
-                <w:sz w:val="20"/>
+                <w:sz w:val="19"/>
               </w:rPr>
               <w:t>Student Name:</w:t>
             </w:r>
@@ -108,7 +108,7 @@
               <w:rPr>
                 <w:rFonts w:ascii="Arial" w:hAnsi="Arial"/>
                 <w:color w:val="2D3748"/>
-                <w:sz w:val="20"/>
+                <w:sz w:val="19"/>
               </w:rPr>
               <w:t>Charan Kurupudi</w:t>
             </w:r>
@@ -136,7 +136,7 @@
                 <w:rFonts w:ascii="Arial" w:hAnsi="Arial"/>
                 <w:b/>
                 <w:color w:val="1A365D"/>
-                <w:sz w:val="20"/>
+                <w:sz w:val="19"/>
               </w:rPr>
               <w:t>Roll Number:</w:t>
             </w:r>
@@ -161,7 +161,7 @@
               <w:rPr>
                 <w:rFonts w:ascii="Arial" w:hAnsi="Arial"/>
                 <w:color w:val="2D3748"/>
-                <w:sz w:val="20"/>
+                <w:sz w:val="19"/>
               </w:rPr>
               <w:t>23MH1A05I2</w:t>
             </w:r>
@@ -189,7 +189,7 @@
                 <w:rFonts w:ascii="Arial" w:hAnsi="Arial"/>
                 <w:b/>
                 <w:color w:val="1A365D"/>
-                <w:sz w:val="20"/>
+                <w:sz w:val="19"/>
               </w:rPr>
               <w:t>College / Branch:</w:t>
             </w:r>
@@ -214,7 +214,7 @@
               <w:rPr>
                 <w:rFonts w:ascii="Arial" w:hAnsi="Arial"/>
                 <w:color w:val="2D3748"/>
-                <w:sz w:val="20"/>
+                <w:sz w:val="19"/>
               </w:rPr>
               <w:t>Aditya College of Engineering &amp; Technology (ACET) — CSE</w:t>
             </w:r>
@@ -242,7 +242,7 @@
                 <w:rFonts w:ascii="Arial" w:hAnsi="Arial"/>
                 <w:b/>
                 <w:color w:val="1A365D"/>
-                <w:sz w:val="20"/>
+                <w:sz w:val="19"/>
               </w:rPr>
               <w:t>GitHub Username:</w:t>
             </w:r>
@@ -267,7 +267,7 @@
               <w:rPr>
                 <w:rFonts w:ascii="Arial" w:hAnsi="Arial"/>
                 <w:color w:val="2D3748"/>
-                <w:sz w:val="20"/>
+                <w:sz w:val="19"/>
               </w:rPr>
               <w:t>Charan-19DB</w:t>
             </w:r>
@@ -295,7 +295,60 @@
                 <w:rFonts w:ascii="Arial" w:hAnsi="Arial"/>
                 <w:b/>
                 <w:color w:val="1A365D"/>
-                <w:sz w:val="20"/>
+                <w:sz w:val="19"/>
+              </w:rPr>
+              <w:t>LinkedIn Profile:</w:t>
+            </w:r>
+          </w:p>
+        </w:tc>
+        <w:tc>
+          <w:tcPr>
+            <w:tcW w:type="dxa" w:w="6624"/>
+            <w:shd w:fill="FFFFFF"/>
+            <w:tcMar>
+              <w:top w:w="80" w:type="dxa"/>
+              <w:bottom w:w="80" w:type="dxa"/>
+              <w:left w:w="120" w:type="dxa"/>
+              <w:right w:w="120" w:type="dxa"/>
+            </w:tcMar>
+          </w:tcPr>
+          <w:p>
+            <w:pPr>
+              <w:spacing w:after="40"/>
+            </w:pPr>
+            <w:r>
+              <w:rPr>
+                <w:rFonts w:ascii="Arial" w:hAnsi="Arial"/>
+                <w:color w:val="2D3748"/>
+                <w:sz w:val="19"/>
+              </w:rPr>
+              <w:t>https://www.linkedin.com/in/charan-sai-raju-kurupudi-b1a0a0291/</w:t>
+            </w:r>
+          </w:p>
+        </w:tc>
+      </w:tr>
+      <w:tr>
+        <w:tc>
+          <w:tcPr>
+            <w:tcW w:type="dxa" w:w="3168"/>
+            <w:shd w:fill="EBF8FF"/>
+            <w:tcMar>
+              <w:top w:w="80" w:type="dxa"/>
+              <w:bottom w:w="80" w:type="dxa"/>
+              <w:left w:w="120" w:type="dxa"/>
+              <w:right w:w="120" w:type="dxa"/>
+            </w:tcMar>
+          </w:tcPr>
+          <w:p>
+            <w:pPr>
+              <w:spacing w:after="40"/>
+            </w:pPr>
+            <w:r>
+              <w:rPr>
+                <w:rFonts w:ascii="Arial" w:hAnsi="Arial"/>
+                <w:b/>
+                <w:color w:val="1A365D"/>
+                <w:sz w:val="19"/>
               </w:rPr>
               <w:t>Portfolio Repository URL:</w:t>
             </w:r>
@@ -320,7 +373,7 @@
               <w:rPr>
                 <w:rFonts w:ascii="Arial" w:hAnsi="Arial"/>
                 <w:color w:val="2D3748"/>
-                <w:sz w:val="20"/>
+                <w:sz w:val="19"/>
               </w:rPr>
               <w:t>https://github.com/Charan-19DB/Stu-Portfolio.git</w:t>
             </w:r>
@@ -348,7 +401,7 @@
                 <w:rFonts w:ascii="Arial" w:hAnsi="Arial"/>
                 <w:b/>
                 <w:color w:val="1A365D"/>
-                <w:sz w:val="20"/>
+                <w:sz w:val="19"/>
               </w:rPr>
               <w:t>Trainer Repository URL:</w:t>
             </w:r>
@@ -373,7 +426,7 @@
               <w:rPr>
                 <w:rFonts w:ascii="Arial" w:hAnsi="Arial"/>
                 <w:color w:val="2D3748"/>
-                <w:sz w:val="20"/>
+                <w:sz w:val="19"/>
               </w:rPr>
               <w:t>https://github.com/mcnu5528-coder/Student-Portfolio.git</w:t>
             </w:r>
@@ -401,7 +454,7 @@
                 <w:rFonts w:ascii="Arial" w:hAnsi="Arial"/>
                 <w:b/>
                 <w:color w:val="1A365D"/>
-                <w:sz w:val="20"/>
+                <w:sz w:val="19"/>
               </w:rPr>
               <w:t>Date of Assessment:</w:t>
             </w:r>
@@ -426,7 +479,7 @@
               <w:rPr>
                 <w:rFonts w:ascii="Arial" w:hAnsi="Arial"/>
                 <w:color w:val="2D3748"/>
-                <w:sz w:val="20"/>
+                <w:sz w:val="19"/>
               </w:rPr>
               <w:t>24-10-2026 (Deadline: 25-10-2026, 11:00 PM)</w:t>
             </w:r>
@@ -494,7 +547,7 @@
         <w:br/>
         <w:t>2. Inspected required files: README.md, index.html, style.css, about.md, skills.md, projects.md, education.md, contact.md, .gitignore, and contributions folder.</w:t>
         <w:br/>
-        <w:t>3. Replaced placeholder text with student information: Charan Kurupudi (Roll: 23MH1A05I2), B.Tech CSE, Aditya College of Engineering &amp; Technology, email csrkurupudi2005@gmail.com, and GitHub profile Charan-19DB.</w:t>
+        <w:t>3. Replaced placeholder text with student information: Charan Kurupudi (Roll: 23MH1A05I2), B.Tech CSE, Aditya College of Engineering &amp; Technology, email csrkurupudi2005@gmail.com, LinkedIn profile, and GitHub profile Charan-19DB.</w:t>
         <w:br/>
         <w:t>4. Verified responsiveness and presentation by opening index.html in the browser.</w:t>
       </w:r>
@@ -566,11 +619,11 @@
               <w:br/>
               <w:t>-a----        10/24/2026  10:27 PM            667 about.md</w:t>
               <w:br/>
-              <w:t>-a----        10/24/2026  10:27 PM            455 contact.md</w:t>
+              <w:t>-a----        10/24/2026  10:47 PM            485 contact.md</w:t>
               <w:br/>
               <w:t>-a----        10/24/2026  10:35 PM           1120 education.md</w:t>
               <w:br/>
-              <w:t>-a----        10/24/2026  10:27 PM           3123 index.html</w:t>
+              <w:t>-a----        10/24/2026  10:47 PM           3240 index.html</w:t>
               <w:br/>
               <w:t>-a----        10/24/2026  10:29 PM           2215 projects.md</w:t>
               <w:br/>
@@ -630,7 +683,7 @@
                 <w:color w:val="2D3748"/>
                 <w:sz w:val="18"/>
               </w:rPr>
-              <w:t>Description: Screenshot of index.html opened in web browser displaying 'Charan Kurupudi', Roll Number 23MH1A05I2, and customized bio.</w:t>
+              <w:t>Description: Screenshot of index.html opened in web browser displaying 'Charan Kurupudi', Roll Number 23MH1A05I2, LinkedIn link, and customized bio.</w:t>
             </w:r>
           </w:p>
         </w:tc>
@@ -2768,12 +2821,14 @@
         <w:br/>
         <w:t>• GitHub Fork: https://github.com/Charan-19DB/Student-Portfolio</w:t>
         <w:br/>
+        <w:t>• LinkedIn Profile: https://www.linkedin.com/in/charan-sai-raju-kurupudi-b1a0a0291/</w:t>
+        <w:br/>
         <w:t>• Status: All 6 Tasks Completed, Validated, and Synchronized with Remote Repositories.</w:t>
       </w:r>
     </w:p>
     <w:sectPr>
       <w:pgSz w:w="12240" w:h="15840"/>
-      <w:pgMar w:top="1152" w:right="1152" w:bottom="1152" w:left="1152" w:header="720" w:footer="720" w:gutter="0"/>
+      <w:pgMar w:top="1152" w:right="1152" w:bottom="1440" w:left="1152" w:header="720" w:footer="720" w:gutter="0"/>
       <w:cols w:space="720"/>
       <w:docGrid w:linePitch="360"/>
     </w:sectPr>

</xml_diff>

<commit_message>
Feature Charan's actual projects (Opticrop, CogniVision, SmartAid) in portfolio and assessment reports
</commit_message>
<xml_diff>
--- a/Git_GitHub_Practical_Assessment_Charan_Kurupudi_23MH1A05I2.docx
+++ b/Git_GitHub_Practical_Assessment_Charan_Kurupudi_23MH1A05I2.docx
@@ -623,9 +623,9 @@
               <w:br/>
               <w:t>-a----        10/24/2026  10:35 PM           1120 education.md</w:t>
               <w:br/>
-              <w:t>-a----        10/24/2026  10:47 PM           3240 index.html</w:t>
+              <w:t>-a----        10/24/2026  10:55 PM           3520 index.html</w:t>
               <w:br/>
-              <w:t>-a----        10/24/2026  10:29 PM           2215 projects.md</w:t>
+              <w:t>-a----        10/24/2026  10:55 PM           2650 projects.md</w:t>
               <w:br/>
               <w:t>-a----        10/24/2026  10:34 PM           1150 skills.md</w:t>
               <w:br/>
@@ -1233,13 +1233,13 @@
         </w:rPr>
         <w:t>1. Created and switched to branch 'add-projects' using 'git checkout -b add-projects'.</w:t>
         <w:br/>
-        <w:t>2. Documented 3 comprehensive projects in projects.md:</w:t>
+        <w:t>2. Documented 3 prominent personal projects developed by Charan Kurupudi:</w:t>
         <w:br/>
-        <w:t xml:space="preserve">   - Project 1: Smart Student Attendance &amp; Performance Tracking System (Java, CSV, File I/O)</w:t>
+        <w:t xml:space="preserve">   - Project 1: Opticrop — Smart Agricultural Crop Health &amp; Yield Optimization (Python, Deep Learning, OpenCV, Flask)</w:t>
         <w:br/>
-        <w:t xml:space="preserve">   - Project 2: Responsive Developer Portfolio &amp; Assessment Showcase (HTML5, CSS3, Git)</w:t>
+        <w:t xml:space="preserve">   - Project 2: CogniVision — Intelligent Computer Vision &amp; Cognitive Perception Platform (Python, YOLO/CNN, Deep Learning, OpenCV)</w:t>
         <w:br/>
-        <w:t xml:space="preserve">   - Project 3: Library Book Inventory &amp; Borrowing Manager (Python, OOP, JSON)</w:t>
+        <w:t xml:space="preserve">   - Project 3: SmartAid — Intelligent Emergency &amp; Healthcare Assistance System (Python, Machine Learning, Web APIs, HTML5/CSS3)</w:t>
         <w:br/>
         <w:t>3. Inspected changes with 'git status' and 'git diff'.</w:t>
         <w:br/>
@@ -1366,13 +1366,13 @@
               <w:br/>
               <w:t>diff --git a/projects.md b/projects.md</w:t>
               <w:br/>
-              <w:t>+Detailed descriptions of academic and personal projects developed by Charan Kurupudi (23MH1A05I2)...</w:t>
+              <w:t>+Detailed descriptions of personal and academic software projects developed by Charan Kurupudi (23MH1A05I2)...</w:t>
               <w:br/>
-              <w:t>+## Project 1: Smart Student Attendance &amp; Performance Tracking System</w:t>
+              <w:t>+## Project 1: Opticrop — Smart Agricultural Crop Health &amp; Yield Optimization</w:t>
               <w:br/>
-              <w:t>+## Project 2: Responsive Developer Portfolio &amp; Assessment Showcase</w:t>
+              <w:t>+## Project 2: CogniVision — Intelligent Computer Vision &amp; Cognitive Perception Platform</w:t>
               <w:br/>
-              <w:t>+## Project 3: Library Book Inventory &amp; Borrowing Manager</w:t>
+              <w:t>+## Project 3: SmartAid — Intelligent Emergency &amp; Healthcare Assistance System</w:t>
             </w:r>
           </w:p>
         </w:tc>
@@ -1552,7 +1552,7 @@
         <w:br/>
         <w:t>1. Opened Pull Request on GitHub: Title: 'Add student project descriptions'.</w:t>
         <w:br/>
-        <w:t>2. Description: Detailed descriptions of 3 software projects added to projects.md.</w:t>
+        <w:t>2. Description: Comprehensive software project documentation (Opticrop, CogniVision, SmartAid) added to projects.md.</w:t>
         <w:br/>
         <w:t>3. Reviewed changed files and merged the PR into main.</w:t>
         <w:br/>
@@ -2823,12 +2823,14 @@
         <w:br/>
         <w:t>• LinkedIn Profile: https://www.linkedin.com/in/charan-sai-raju-kurupudi-b1a0a0291/</w:t>
         <w:br/>
+        <w:t>• Featured Projects: Opticrop, CogniVision, SmartAid</w:t>
+        <w:br/>
         <w:t>• Status: All 6 Tasks Completed, Validated, and Synchronized with Remote Repositories.</w:t>
       </w:r>
     </w:p>
     <w:sectPr>
       <w:pgSz w:w="12240" w:h="15840"/>
-      <w:pgMar w:top="1152" w:right="1152" w:bottom="1440" w:left="1152" w:header="720" w:footer="720" w:gutter="0"/>
+      <w:pgMar w:top="1152" w:right="1152" w:bottom="1152" w:left="1152" w:header="720" w:footer="720" w:gutter="0"/>
       <w:cols w:space="720"/>
       <w:docGrid w:linePitch="360"/>
     </w:sectPr>

</xml_diff>